<commit_message>
Ažuriraj goste za stolove 7 i 50
</commit_message>
<xml_diff>
--- a/stolovipopis/Stol 7.docx
+++ b/stolovipopis/Stol 7.docx
@@ -268,26 +268,6 @@
           <w:lang w:val="hr-BA"/>
         </w:rPr>
         <w:t>Gradečak Matej</w:t>
-      </w:r>
-    </w:p>
-    <w:p>
-      <w:pPr>
-        <w:pStyle w:val="Listenabsatz"/>
-        <w:numPr>
-          <w:ilvl w:val="0"/>
-          <w:numId w:val="2"/>
-        </w:numPr>
-        <w:rPr>
-          <w:lang w:val="hr-BA"/>
-        </w:rPr>
-      </w:pPr>
-      <w:r>
-        <w:rPr>
-          <w:sz w:val="40"/>
-          <w:szCs w:val="40"/>
-          <w:lang w:val="hr-BA"/>
-        </w:rPr>
-        <w:t>Kralj Paula</w:t>
       </w:r>
     </w:p>
     <w:sectPr>

</xml_diff>